<commit_message>
almost all working responsive and dark mode added styling
</commit_message>
<xml_diff>
--- a/Think of your layout as 3 main sections.docx
+++ b/Think of your layout as 3 main sections.docx
@@ -471,7 +471,7 @@
     <w:p>
       <w:r>
         <w:pict w14:anchorId="06107A4C">
-          <v:rect id="_x0000_i1154" style="width:0;height:.75pt" o:hralign="center" o:hrstd="t" o:hr="t" fillcolor="#a0a0a0" stroked="f"/>
+          <v:rect id="_x0000_i1025" style="width:0;height:.75pt" o:hralign="center" o:hrstd="t" o:hr="t" fillcolor="#a0a0a0" stroked="f"/>
         </w:pict>
       </w:r>
     </w:p>
@@ -914,7 +914,7 @@
     <w:p>
       <w:r>
         <w:pict w14:anchorId="41306471">
-          <v:rect id="_x0000_i1155" style="width:0;height:.75pt" o:hralign="center" o:hrstd="t" o:hr="t" fillcolor="#a0a0a0" stroked="f"/>
+          <v:rect id="_x0000_i1026" style="width:0;height:.75pt" o:hralign="center" o:hrstd="t" o:hr="t" fillcolor="#a0a0a0" stroked="f"/>
         </w:pict>
       </w:r>
     </w:p>
@@ -1059,6 +1059,9 @@
     </w:p>
     <w:p>
       <w:r>
+        <w:rPr>
+          <w:noProof/>
+        </w:rPr>
         <w:drawing>
           <wp:inline distT="0" distB="0" distL="0" distR="0" wp14:anchorId="788A0AAE" wp14:editId="4F85918E">
             <wp:extent cx="3657600" cy="1706880"/>
@@ -1587,7 +1590,7 @@
     <w:p>
       <w:r>
         <w:pict w14:anchorId="62C8A7ED">
-          <v:rect id="_x0000_i1157" style="width:0;height:.75pt" o:hralign="center" o:hrstd="t" o:hr="t" fillcolor="#a0a0a0" stroked="f"/>
+          <v:rect id="_x0000_i1027" style="width:0;height:.75pt" o:hralign="center" o:hrstd="t" o:hr="t" fillcolor="#a0a0a0" stroked="f"/>
         </w:pict>
       </w:r>
     </w:p>
@@ -1947,7 +1950,7 @@
     <w:p>
       <w:r>
         <w:pict w14:anchorId="46DF0C88">
-          <v:rect id="_x0000_i1158" style="width:0;height:.75pt" o:hralign="center" o:hrstd="t" o:hr="t" fillcolor="#a0a0a0" stroked="f"/>
+          <v:rect id="_x0000_i1028" style="width:0;height:.75pt" o:hralign="center" o:hrstd="t" o:hr="t" fillcolor="#a0a0a0" stroked="f"/>
         </w:pict>
       </w:r>
     </w:p>
@@ -2104,6 +2107,9 @@
       </w:r>
     </w:p>
     <w:p>
+      <w:pPr>
+        <w:ind w:left="720" w:hanging="720"/>
+      </w:pPr>
       <w:r>
         <w:br w:type="page"/>
       </w:r>
@@ -6044,6 +6050,7 @@
   <w:style w:type="character" w:default="1" w:styleId="DefaultParagraphFont">
     <w:name w:val="Default Paragraph Font"/>
     <w:uiPriority w:val="1"/>
+    <w:semiHidden/>
     <w:unhideWhenUsed/>
   </w:style>
   <w:style w:type="table" w:default="1" w:styleId="TableNormal">

</xml_diff>